<commit_message>
Synchronize publication governance with 10-page structure
</commit_message>
<xml_diff>
--- a/References/Minden_Game_Notes_Publication_Governance_Standard.docx
+++ b/References/Minden_Game_Notes_Publication_Governance_Standard.docx
@@ -9,7 +9,7 @@
       <w:r>
         <w:rPr>
           <w:b/>
-          <w:sz w:val="40"/>
+          <w:sz w:val="36"/>
         </w:rPr>
         <w:t>MINDEN HIGH SCHOOL GAME NOTES</w:t>
       </w:r>
@@ -47,7 +47,7 @@
     </w:p>
     <w:p>
       <w:r>
-        <w:t>This standard governs how the Minden High School Game Notes publication is maintained, updated, rendered, reviewed, and changed. It protects the approved publication design from week-to-week drift regardless of production tool. The standard governs the process; the tool does not govern the publication.</w:t>
+        <w:t>This standard governs how the Minden High School Game Notes publication is maintained, updated, rendered, reviewed, and changed. It protects the approved publication identity from week-to-week drift regardless of production tool. The standard governs the process; the tool does not govern the publication.</w:t>
       </w:r>
     </w:p>
     <w:p>
@@ -71,7 +71,7 @@
         <w:pStyle w:val="ListBullet"/>
       </w:pPr>
       <w:r>
-        <w:t>2. 2026 Production Guide — authority for page purpose, weekly/static behavior, and production workflow.</w:t>
+        <w:t>2. 2026 Production Guide — authority for page purpose, weekly/static behavior, source authority, and production workflow.</w:t>
       </w:r>
     </w:p>
     <w:p>
@@ -95,7 +95,7 @@
         <w:pStyle w:val="ListBullet"/>
       </w:pPr>
       <w:r>
-        <w:t>5. Golden Masters — accepted PDF/PNG visual proofs used to detect design drift.</w:t>
+        <w:t>5. Visual Reference Masters — accepted PDF/PNG pages and accepted weekly editions used to preserve publication quality and continuity.</w:t>
       </w:r>
     </w:p>
     <w:p>
@@ -193,6 +193,7 @@
         <w:tc>
           <w:tcPr>
             <w:tcW w:type="dxa" w:w="3456"/>
+            <w:vAlign w:val="center"/>
           </w:tcPr>
           <w:p>
             <w:r>
@@ -203,6 +204,7 @@
         <w:tc>
           <w:tcPr>
             <w:tcW w:type="dxa" w:w="3456"/>
+            <w:vAlign w:val="center"/>
           </w:tcPr>
           <w:p>
             <w:r>
@@ -213,6 +215,7 @@
         <w:tc>
           <w:tcPr>
             <w:tcW w:type="dxa" w:w="3456"/>
+            <w:vAlign w:val="center"/>
           </w:tcPr>
           <w:p>
             <w:r>
@@ -225,6 +228,7 @@
         <w:tc>
           <w:tcPr>
             <w:tcW w:type="dxa" w:w="3456"/>
+            <w:vAlign w:val="center"/>
           </w:tcPr>
           <w:p>
             <w:r>
@@ -235,6 +239,7 @@
         <w:tc>
           <w:tcPr>
             <w:tcW w:type="dxa" w:w="3456"/>
+            <w:vAlign w:val="center"/>
           </w:tcPr>
           <w:p>
             <w:r>
@@ -245,6 +250,7 @@
         <w:tc>
           <w:tcPr>
             <w:tcW w:type="dxa" w:w="3456"/>
+            <w:vAlign w:val="center"/>
           </w:tcPr>
           <w:p>
             <w:r>
@@ -257,6 +263,7 @@
         <w:tc>
           <w:tcPr>
             <w:tcW w:type="dxa" w:w="3456"/>
+            <w:vAlign w:val="center"/>
           </w:tcPr>
           <w:p>
             <w:r>
@@ -267,20 +274,22 @@
         <w:tc>
           <w:tcPr>
             <w:tcW w:type="dxa" w:w="3456"/>
+            <w:vAlign w:val="center"/>
           </w:tcPr>
           <w:p>
             <w:r>
-              <w:t>Page 7 Nerd Notes cards, Stat of the Week selection, flexible editorial copy</w:t>
+              <w:t>Page 7 Nerd Notes, Stat of the Week selection, flexible editorial copy</w:t>
             </w:r>
           </w:p>
         </w:tc>
         <w:tc>
           <w:tcPr>
             <w:tcW w:type="dxa" w:w="3456"/>
+            <w:vAlign w:val="center"/>
           </w:tcPr>
           <w:p>
             <w:r>
-              <w:t>Editorial review; must stay inside governed regions</w:t>
+              <w:t>Editorial review; must remain consistent with governed publication identity</w:t>
             </w:r>
           </w:p>
         </w:tc>
@@ -289,6 +298,7 @@
         <w:tc>
           <w:tcPr>
             <w:tcW w:type="dxa" w:w="3456"/>
+            <w:vAlign w:val="center"/>
           </w:tcPr>
           <w:p>
             <w:r>
@@ -299,6 +309,7 @@
         <w:tc>
           <w:tcPr>
             <w:tcW w:type="dxa" w:w="3456"/>
+            <w:vAlign w:val="center"/>
           </w:tcPr>
           <w:p>
             <w:r>
@@ -309,6 +320,7 @@
         <w:tc>
           <w:tcPr>
             <w:tcW w:type="dxa" w:w="3456"/>
+            <w:vAlign w:val="center"/>
           </w:tcPr>
           <w:p>
             <w:r>
@@ -321,6 +333,7 @@
         <w:tc>
           <w:tcPr>
             <w:tcW w:type="dxa" w:w="3456"/>
+            <w:vAlign w:val="center"/>
           </w:tcPr>
           <w:p>
             <w:r>
@@ -331,16 +344,18 @@
         <w:tc>
           <w:tcPr>
             <w:tcW w:type="dxa" w:w="3456"/>
+            <w:vAlign w:val="center"/>
           </w:tcPr>
           <w:p>
             <w:r>
-              <w:t>Moving/resizing containers, changing fonts/primitives, permanent section changes</w:t>
+              <w:t>Permanent page-purpose, typography, visual-system, or recurring structural changes</w:t>
             </w:r>
           </w:p>
         </w:tc>
         <w:tc>
           <w:tcPr>
             <w:tcW w:type="dxa" w:w="3456"/>
+            <w:vAlign w:val="center"/>
           </w:tcPr>
           <w:p>
             <w:r>
@@ -355,7 +370,7 @@
         <w:pStyle w:val="Heading1"/>
       </w:pPr>
       <w:r>
-        <w:t>6. Controlled Uniformity Rule</w:t>
+        <w:t>6. Controlled Uniformity and Standard Page Structure</w:t>
       </w:r>
     </w:p>
     <w:p>
@@ -364,6 +379,62 @@
       </w:pPr>
       <w:r>
         <w:t>Recurring publication identity is locked: masthead/logo treatment, typography families, grayscale language, standard header/footer, page margins, section-heading treatment, border/rule style, and overall information hierarchy.</w:t>
+      </w:r>
+    </w:p>
+    <w:p>
+      <w:pPr>
+        <w:pStyle w:val="ListBullet"/>
+      </w:pPr>
+      <w:r>
+        <w:t>The standard 2026 publication is 10 pages / five duplex sheets.</w:t>
+      </w:r>
+    </w:p>
+    <w:p>
+      <w:pPr>
+        <w:pStyle w:val="ListBullet"/>
+      </w:pPr>
+      <w:r>
+        <w:t>Pages 1–6 retain their established recurring information purposes while permitting controlled composition for actual weekly content.</w:t>
+      </w:r>
+    </w:p>
+    <w:p>
+      <w:pPr>
+        <w:pStyle w:val="ListBullet"/>
+      </w:pPr>
+      <w:r>
+        <w:t>Page 7 remains intentionally more editorially flexible under Mark's weekly research and editorial direction.</w:t>
+      </w:r>
+    </w:p>
+    <w:p>
+      <w:pPr>
+        <w:pStyle w:val="ListBullet"/>
+      </w:pPr>
+      <w:r>
+        <w:t>Page 8 is the Minden roster: a full-page game-day reference.</w:t>
+      </w:r>
+    </w:p>
+    <w:p>
+      <w:pPr>
+        <w:pStyle w:val="ListBullet"/>
+      </w:pPr>
+      <w:r>
+        <w:t>Page 9 is the opponent roster: a full-page game-day reference.</w:t>
+      </w:r>
+    </w:p>
+    <w:p>
+      <w:pPr>
+        <w:pStyle w:val="ListBullet"/>
+      </w:pPr>
+      <w:r>
+        <w:t>Pages 8–9 prioritize large, quickly readable roster information over decorative density or minimizing page count. Exact roster geometry may be refined under the Production Guide's readability rules.</w:t>
+      </w:r>
+    </w:p>
+    <w:p>
+      <w:pPr>
+        <w:pStyle w:val="ListBullet"/>
+      </w:pPr>
+      <w:r>
+        <w:t>Page 10 is the intentionally minimal Notes page, preserving useful writable workspace.</w:t>
       </w:r>
     </w:p>
     <w:p>
@@ -387,7 +458,7 @@
         <w:pStyle w:val="ListBullet"/>
       </w:pPr>
       <w:r>
-        <w:t>Page 7 remains intentionally more editorially flexible; Page 8 remains an intentionally minimal notes page.</w:t>
+        <w:t>Weekly variation must solve a content or readability need. Arbitrary stylistic experimentation is not permitted.</w:t>
       </w:r>
     </w:p>
     <w:p>
@@ -395,7 +466,7 @@
         <w:pStyle w:val="ListBullet"/>
       </w:pPr>
       <w:r>
-        <w:t>Weekly variation must solve a content or readability need. Arbitrary stylistic experimentation is not permitted.</w:t>
+        <w:t>Operational source/update details for Pages 8–10 are governed by the current 2026 Production Guide.</w:t>
       </w:r>
     </w:p>
     <w:p>
@@ -509,7 +580,7 @@
         <w:pStyle w:val="ListBullet"/>
       </w:pPr>
       <w:r>
-        <w:t>Golden Masters are preserved and never overwritten by weekly output.</w:t>
+        <w:t>Visual Reference Masters are preserved and never overwritten by weekly output.</w:t>
       </w:r>
     </w:p>
     <w:p>
@@ -517,7 +588,7 @@
         <w:pStyle w:val="ListBullet"/>
       </w:pPr>
       <w:r>
-        <w:t>Template revisions require a newly accepted Golden Master.</w:t>
+        <w:t>Permanent design revisions require a newly accepted reference proof or accepted weekly edition reflecting the change.</w:t>
       </w:r>
     </w:p>
     <w:p>
@@ -634,7 +705,7 @@
         <w:pStyle w:val="ListBullet"/>
       </w:pPr>
       <w:r>
-        <w:t>Calculated totals and percentages derive from verified underlying values rather than manually carrying forward displayed numbers.</w:t>
+        <w:t>Calculated totals and percentages derive from verified underlying values rather than manually carrying forward displayed numbers, except where the Production Guide explicitly designates a source report's displayed value as the publication authority.</w:t>
       </w:r>
     </w:p>
     <w:p>
@@ -670,58 +741,91 @@
       </w:r>
     </w:p>
     <w:p>
+      <w:pPr>
+        <w:pStyle w:val="ListNumber"/>
+      </w:pPr>
       <w:r>
-        <w:t>1. Create the new week from the prior accepted template/project baseline.</w:t>
+        <w:t>Create/select the weekly project from the prior accepted project/publication baseline.</w:t>
       </w:r>
     </w:p>
     <w:p>
+      <w:pPr>
+        <w:pStyle w:val="ListNumber"/>
+      </w:pPr>
       <w:r>
-        <w:t>2. Update only fields permitted by the page contracts.</w:t>
+        <w:t>Refresh configured source locations and identify expected weekly source documents.</w:t>
       </w:r>
     </w:p>
     <w:p>
+      <w:pPr>
+        <w:pStyle w:val="ListNumber"/>
+      </w:pPr>
       <w:r>
-        <w:t>3. Import current statistics and mapped record data.</w:t>
+        <w:t>Review source status and import current statistics, schedules, rosters, ratings, and mapped record data as applicable.</w:t>
       </w:r>
     </w:p>
     <w:p>
+      <w:pPr>
+        <w:pStyle w:val="ListNumber"/>
+      </w:pPr>
       <w:r>
-        <w:t>4. Review and accept imported values; resolve validation failures.</w:t>
+        <w:t>Review and accept imported values; resolve validation failures and stale/missing-source conditions.</w:t>
       </w:r>
     </w:p>
     <w:p>
+      <w:pPr>
+        <w:pStyle w:val="ListNumber"/>
+      </w:pPr>
       <w:r>
-        <w:t>5. Run deterministic calculations and conditional historical updates.</w:t>
+        <w:t>Run only the deterministic calculations and conditional historical updates authorized by the Production Guide.</w:t>
       </w:r>
     </w:p>
     <w:p>
+      <w:pPr>
+        <w:pStyle w:val="ListNumber"/>
+      </w:pPr>
       <w:r>
-        <w:t>6. Complete editorial fields and Page 7 composition.</w:t>
+        <w:t>Prepare page-specific information packages and complete editorial fields, including Mark-directed Page 7 composition.</w:t>
       </w:r>
     </w:p>
     <w:p>
+      <w:pPr>
+        <w:pStyle w:val="ListNumber"/>
+      </w:pPr>
       <w:r>
-        <w:t>7. Render the complete publication.</w:t>
+        <w:t>Compose the complete 10-page publication from verified information and approved visual references.</w:t>
       </w:r>
     </w:p>
     <w:p>
+      <w:pPr>
+        <w:pStyle w:val="ListNumber"/>
+      </w:pPr>
       <w:r>
-        <w:t>8. Run bounds/technical validation.</w:t>
+        <w:t>Run technical validation and inspect for clipping, wrapping, overflow, stale data, hierarchy, and continuity.</w:t>
       </w:r>
     </w:p>
     <w:p>
+      <w:pPr>
+        <w:pStyle w:val="ListNumber"/>
+      </w:pPr>
       <w:r>
-        <w:t>9. Perform human visual review for stale data, clipping, wrapping, hierarchy, and design drift.</w:t>
+        <w:t>Perform human visual review against the prior accepted edition and applicable Visual Reference Masters.</w:t>
       </w:r>
     </w:p>
     <w:p>
+      <w:pPr>
+        <w:pStyle w:val="ListNumber"/>
+      </w:pPr>
       <w:r>
-        <w:t>10. Perform final statistical/historical verification.</w:t>
+        <w:t>Perform final statistical/historical verification.</w:t>
       </w:r>
     </w:p>
     <w:p>
+      <w:pPr>
+        <w:pStyle w:val="ListNumber"/>
+      </w:pPr>
       <w:r>
-        <w:t>11. Export/publish only after all required gates pass.</w:t>
+        <w:t>Export/publish only after all required gates pass.</w:t>
       </w:r>
     </w:p>
     <w:p>
@@ -737,7 +841,7 @@
         <w:pStyle w:val="ListBullet"/>
       </w:pPr>
       <w:r>
-        <w:t>AI may update governed variable content, analyze source data, propose editorial material, and implement explicitly authorized template work.</w:t>
+        <w:t>AI may acquire, parse, normalize, organize, cross-reference, and propose material; update governed variable content; analyze source data; and implement explicitly authorized work.</w:t>
       </w:r>
     </w:p>
     <w:p>
@@ -745,7 +849,7 @@
         <w:pStyle w:val="ListBullet"/>
       </w:pPr>
       <w:r>
-        <w:t>AI must not reinterpret a locked page because a new conversation lacks context.</w:t>
+        <w:t>The Information Builder prepares verified information and readiness/preview outputs; it is not the autonomous authority for final publication design.</w:t>
       </w:r>
     </w:p>
     <w:p>
@@ -753,7 +857,7 @@
         <w:pStyle w:val="ListBullet"/>
       </w:pPr>
       <w:r>
-        <w:t>AI must use the Production Guide, page contract, Golden Master, and stored template specification rather than relying on conversational memory.</w:t>
+        <w:t>AI must not reinterpret publication identity because a new conversation lacks context.</w:t>
       </w:r>
     </w:p>
     <w:p>
@@ -761,7 +865,7 @@
         <w:pStyle w:val="ListBullet"/>
       </w:pPr>
       <w:r>
-        <w:t>AI-generated visual experiments are not templates until explicitly reviewed and approved.</w:t>
+        <w:t>AI must use the Governance Standard, Production Guide, page-specific rules, Visual Reference Masters, accepted prior editions, and authoritative weekly data rather than relying on conversational memory.</w:t>
       </w:r>
     </w:p>
     <w:p>
@@ -769,7 +873,15 @@
         <w:pStyle w:val="ListBullet"/>
       </w:pPr>
       <w:r>
-        <w:t>If a required source/asset is missing, implementation stops rather than inventing a substitute that changes publication identity.</w:t>
+        <w:t>AI-generated visual experiments are not publication baselines until explicitly reviewed and approved.</w:t>
+      </w:r>
+    </w:p>
+    <w:p>
+      <w:pPr>
+        <w:pStyle w:val="ListBullet"/>
+      </w:pPr>
+      <w:r>
+        <w:t>If a required source/asset is missing, implementation stops rather than inventing a substitute that changes publication identity or factual authority.</w:t>
       </w:r>
     </w:p>
     <w:p>
@@ -785,52 +897,79 @@
         <w:pStyle w:val="Heading1"/>
       </w:pPr>
       <w:r>
-        <w:t>13. Template Revision Procedure</w:t>
+        <w:t>13. Template / Publication Revision Procedure</w:t>
       </w:r>
     </w:p>
     <w:p>
+      <w:pPr>
+        <w:pStyle w:val="ListNumber"/>
+      </w:pPr>
       <w:r>
-        <w:t>1. Identify the specific limitation or desired change.</w:t>
+        <w:t>Identify the specific limitation or desired change.</w:t>
       </w:r>
     </w:p>
     <w:p>
+      <w:pPr>
+        <w:pStyle w:val="ListNumber"/>
+      </w:pPr>
       <w:r>
-        <w:t>2. Classify it as a template/design revision.</w:t>
+        <w:t>Classify the change under this governance standard.</w:t>
       </w:r>
     </w:p>
     <w:p>
+      <w:pPr>
+        <w:pStyle w:val="ListNumber"/>
+      </w:pPr>
       <w:r>
-        <w:t>3. Preserve the current accepted baseline.</w:t>
+        <w:t>Preserve the current accepted baseline.</w:t>
       </w:r>
     </w:p>
     <w:p>
+      <w:pPr>
+        <w:pStyle w:val="ListNumber"/>
+      </w:pPr>
       <w:r>
-        <w:t>4. Implement the smallest necessary change.</w:t>
+        <w:t>Implement the smallest necessary change.</w:t>
       </w:r>
     </w:p>
     <w:p>
+      <w:pPr>
+        <w:pStyle w:val="ListNumber"/>
+      </w:pPr>
       <w:r>
-        <w:t>5. Produce a full-page proof and comparison against the current Golden Master.</w:t>
+        <w:t>Produce an appropriate full-page proof or weekly composition for review when the change affects publication presentation.</w:t>
       </w:r>
     </w:p>
     <w:p>
+      <w:pPr>
+        <w:pStyle w:val="ListNumber"/>
+      </w:pPr>
       <w:r>
-        <w:t>6. Review visual, statistical, and operational consequences.</w:t>
+        <w:t>Review visual, statistical, operational, and source-authority consequences.</w:t>
       </w:r>
     </w:p>
     <w:p>
+      <w:pPr>
+        <w:pStyle w:val="ListNumber"/>
+      </w:pPr>
       <w:r>
-        <w:t>7. Explicitly accept or reject the revision.</w:t>
+        <w:t>Explicitly accept or reject the revision.</w:t>
       </w:r>
     </w:p>
     <w:p>
+      <w:pPr>
+        <w:pStyle w:val="ListNumber"/>
+      </w:pPr>
       <w:r>
-        <w:t>8. If accepted, update the page contract, Production Guide if needed, Golden Master, and change log.</w:t>
+        <w:t>If accepted, update the applicable page rule/contract, Production Guide if needed, Visual Reference Master, and change log.</w:t>
       </w:r>
     </w:p>
     <w:p>
+      <w:pPr>
+        <w:pStyle w:val="ListNumber"/>
+      </w:pPr>
       <w:r>
-        <w:t>9. If rejected, revert to the prior accepted baseline.</w:t>
+        <w:t>If rejected, revert to the prior accepted baseline.</w:t>
       </w:r>
     </w:p>
     <w:p>
@@ -868,7 +1007,6 @@
       </w:r>
     </w:p>
     <w:p>
-      <w:pPr/>
       <w:r>
         <w:t>When updating a page for a new week, retain as much of the previous accepted composition as practical. Change only what the new week's content requires, what improves fit/readability, or what has been explicitly requested. Do not redesign unaffected regions simply because recomposition is permitted.</w:t>
       </w:r>
@@ -882,9 +1020,8 @@
       </w:r>
     </w:p>
     <w:p>
-      <w:pPr/>
       <w:r>
-        <w:t>Before publication, compare each newly composed page against the prior accepted edition and the applicable Visual Reference Master. Review masthead identity, typography, hierarchy, section treatments, density, alignment, footer/header consistency, and overall publication character. Controlled variation passes; unexplained stylistic drift does not.</w:t>
+        <w:t>Before publication, compare each newly composed page against the prior accepted edition and the applicable Visual Reference Master. Review masthead identity, typography, hierarchy, section treatments, density, alignment, footer/header consistency, roster readability, and overall publication character. Controlled variation passes; unexplained stylistic drift does not.</w:t>
       </w:r>
     </w:p>
     <w:p>
@@ -899,6 +1036,7 @@
       <w:tblPr>
         <w:tblStyle w:val="TableGrid"/>
         <w:tblW w:type="auto" w:w="0"/>
+        <w:jc w:val="center"/>
         <w:tblLook w:firstColumn="1" w:firstRow="1" w:lastColumn="0" w:lastRow="0" w:noHBand="0" w:noVBand="1" w:val="04A0"/>
       </w:tblPr>
       <w:tblGrid>
@@ -997,7 +1135,9 @@
             <w:tcW w:type="dxa" w:w="2592"/>
           </w:tcPr>
           <w:p>
-            <w:r/>
+            <w:r>
+              <w:t>2026-08-23</w:t>
+            </w:r>
           </w:p>
         </w:tc>
         <w:tc>
@@ -1005,7 +1145,9 @@
             <w:tcW w:type="dxa" w:w="2592"/>
           </w:tcPr>
           <w:p>
-            <w:r/>
+            <w:r>
+              <w:t>Publication Structure</w:t>
+            </w:r>
           </w:p>
         </w:tc>
         <w:tc>
@@ -1013,7 +1155,9 @@
             <w:tcW w:type="dxa" w:w="2592"/>
           </w:tcPr>
           <w:p>
-            <w:r/>
+            <w:r>
+              <w:t>Synchronized governance to the accepted 10-page / five-duplex-sheet structure: Page 8 Minden roster, Page 9 opponent roster, Page 10 Notes; added roster readability priority and aligned Information Builder boundaries.</w:t>
+            </w:r>
           </w:p>
         </w:tc>
         <w:tc>
@@ -1021,75 +1165,9 @@
             <w:tcW w:type="dxa" w:w="2592"/>
           </w:tcPr>
           <w:p>
-            <w:r/>
-          </w:p>
-        </w:tc>
-      </w:tr>
-      <w:tr>
-        <w:tc>
-          <w:tcPr>
-            <w:tcW w:type="dxa" w:w="2592"/>
-          </w:tcPr>
-          <w:p>
-            <w:r/>
-          </w:p>
-        </w:tc>
-        <w:tc>
-          <w:tcPr>
-            <w:tcW w:type="dxa" w:w="2592"/>
-          </w:tcPr>
-          <w:p>
-            <w:r/>
-          </w:p>
-        </w:tc>
-        <w:tc>
-          <w:tcPr>
-            <w:tcW w:type="dxa" w:w="2592"/>
-          </w:tcPr>
-          <w:p>
-            <w:r/>
-          </w:p>
-        </w:tc>
-        <w:tc>
-          <w:tcPr>
-            <w:tcW w:type="dxa" w:w="2592"/>
-          </w:tcPr>
-          <w:p>
-            <w:r/>
-          </w:p>
-        </w:tc>
-      </w:tr>
-      <w:tr>
-        <w:tc>
-          <w:tcPr>
-            <w:tcW w:type="dxa" w:w="2592"/>
-          </w:tcPr>
-          <w:p>
-            <w:r/>
-          </w:p>
-        </w:tc>
-        <w:tc>
-          <w:tcPr>
-            <w:tcW w:type="dxa" w:w="2592"/>
-          </w:tcPr>
-          <w:p>
-            <w:r/>
-          </w:p>
-        </w:tc>
-        <w:tc>
-          <w:tcPr>
-            <w:tcW w:type="dxa" w:w="2592"/>
-          </w:tcPr>
-          <w:p>
-            <w:r/>
-          </w:p>
-        </w:tc>
-        <w:tc>
-          <w:tcPr>
-            <w:tcW w:type="dxa" w:w="2592"/>
-          </w:tcPr>
-          <w:p>
-            <w:r/>
+            <w:r>
+              <w:t>Approved direction</w:t>
+            </w:r>
           </w:p>
         </w:tc>
       </w:tr>
@@ -1101,7 +1179,6 @@
       <w:r>
         <w:rPr>
           <w:b/>
-          <w:sz w:val="18"/>
         </w:rPr>
         <w:t>GOVERNING PRINCIPLE: PRESERVE THE IDENTITY. COMPOSE FOR THE CONTENT.</w:t>
       </w:r>
@@ -1481,7 +1558,7 @@
     <w:rsid w:val="00FC693F"/>
     <w:rPr>
       <w:rFonts w:ascii="Arial" w:hAnsi="Arial"/>
-      <w:sz w:val="18"/>
+      <w:sz w:val="19"/>
     </w:rPr>
   </w:style>
   <w:style w:type="paragraph" w:styleId="Header">
@@ -1547,7 +1624,7 @@
       <w:b/>
       <w:bCs/>
       <w:color w:val="365F91" w:themeColor="accent1" w:themeShade="BF"/>
-      <w:sz w:val="30"/>
+      <w:sz w:val="26"/>
       <w:szCs w:val="28"/>
     </w:rPr>
   </w:style>

</xml_diff>